<commit_message>
Update submission documentation and code report
</commit_message>
<xml_diff>
--- a/documentation/FMA_Capstone_Management_Report_Julian_Devonish.docx
+++ b/documentation/FMA_Capstone_Management_Report_Julian_Devonish.docx
@@ -4,17 +4,18 @@
   <w:body>
     <w:p>
       <w:pPr>
+        <w:pStyle w:val="Title"/>
         <w:spacing w:before="1200"/>
         <w:jc w:val="center"/>
       </w:pPr>
       <w:r>
         <w:rPr>
-          <w:rFonts w:ascii="Calibri" w:hAnsi="Calibri"/>
+          <w:rFonts w:ascii="Arial" w:hAnsi="Arial"/>
           <w:b/>
-          <w:color w:val="008080"/>
-          <w:sz w:val="26"/>
+          <w:color w:val="0B3D3A"/>
+          <w:sz w:val="40"/>
         </w:rPr>
-        <w:t>MANAGEMENT REPORT</w:t>
+        <w:t>Management Report</w:t>
       </w:r>
     </w:p>
     <w:p>
@@ -23,10 +24,10 @@
       </w:pPr>
       <w:r>
         <w:rPr>
-          <w:rFonts w:ascii="Calibri" w:hAnsi="Calibri"/>
+          <w:rFonts w:ascii="Arial" w:hAnsi="Arial"/>
           <w:b/>
-          <w:color w:val="0B2545"/>
-          <w:sz w:val="44"/>
+          <w:color w:val="282828"/>
+          <w:sz w:val="26"/>
         </w:rPr>
         <w:t>Scalable Music Genre Classification and Audio Analytics Using the Free Music Archive Dataset</w:t>
       </w:r>
@@ -37,10 +38,11 @@
       </w:pPr>
       <w:r>
         <w:rPr>
-          <w:rFonts w:ascii="Calibri" w:hAnsi="Calibri"/>
+          <w:rFonts w:ascii="Arial" w:hAnsi="Arial"/>
+          <w:b w:val="0"/>
           <w:i/>
           <w:color w:val="5A5A5A"/>
-          <w:sz w:val="26"/>
+          <w:sz w:val="22"/>
         </w:rPr>
         <w:t>Decision-Oriented Summary for Project Review</w:t>
       </w:r>
@@ -51,9 +53,10 @@
       </w:pPr>
       <w:r>
         <w:rPr>
-          <w:rFonts w:ascii="Calibri" w:hAnsi="Calibri"/>
+          <w:rFonts w:ascii="Arial" w:hAnsi="Arial"/>
+          <w:b w:val="0"/>
           <w:color w:val="282828"/>
-          <w:sz w:val="22"/>
+          <w:sz w:val="20"/>
         </w:rPr>
         <w:t>Student: Julian Devonish</w:t>
         <w:br/>
@@ -88,13 +91,14 @@
       <w:pPr/>
       <w:r/>
       <w:r>
-        <w:t>The reason for that position comes from the final evidence. Notebook 49 produced strong internal FMA test results, including Top-1 hit-any = 72.0%, Top-3 hit-any = 98.0%, and Top-5 hit-any = 99.0% across 100 test tracks with no prediction errors. Notebook 50 tested 60 external open-licence songs and produced Top-1 = 21.7%, Top-3 = 63.3%, and Top-5 = 83.3%. The difference between those results is not a problem to hide. It is the clearest guide for how the model should be presented.</w:t>
+        <w:t>The reason for that position comes from the final evidence. Notebook 49 produced strong internal FMA test results, including Top-1 hit-any = 72.0%, Top-3 hit-any = 98.0%, and Top-5 hit-any = 99.0% across 100 test tracks with no prediction errors. Notebook 50 tested 60 external open-licence songs and produced Top-1 = 21.7%, Top-3 = 66.7%, and Top-5 = 83.3%. The difference between those results is not a problem to hide. It is the clearest guide for how the model should be presented.</w:t>
       </w:r>
     </w:p>
     <w:tbl>
       <w:tblPr>
         <w:tblStyle w:val="TableGrid"/>
         <w:tblW w:type="auto" w:w="0"/>
+        <w:jc w:val="center"/>
         <w:tblLook w:firstColumn="1" w:firstRow="1" w:lastColumn="0" w:lastRow="0" w:noHBand="0" w:noVBand="1" w:val="04A0"/>
       </w:tblPr>
       <w:tblGrid>
@@ -105,7 +109,8 @@
         <w:tc>
           <w:tcPr>
             <w:tcW w:type="dxa" w:w="5040"/>
-            <w:shd w:fill="1F4D78"/>
+            <w:shd w:fill="0B3D3A"/>
+            <w:vAlign w:val="center"/>
           </w:tcPr>
           <w:p>
             <w:pPr>
@@ -113,10 +118,10 @@
             </w:pPr>
             <w:r>
               <w:rPr>
-                <w:rFonts w:ascii="Calibri" w:hAnsi="Calibri"/>
+                <w:rFonts w:ascii="Arial" w:hAnsi="Arial"/>
                 <w:b/>
                 <w:color w:val="FFFFFF"/>
-                <w:sz w:val="18"/>
+                <w:sz w:val="17"/>
               </w:rPr>
               <w:t>Decision area</w:t>
             </w:r>
@@ -125,7 +130,8 @@
         <w:tc>
           <w:tcPr>
             <w:tcW w:type="dxa" w:w="5040"/>
-            <w:shd w:fill="1F4D78"/>
+            <w:shd w:fill="0B3D3A"/>
+            <w:vAlign w:val="center"/>
           </w:tcPr>
           <w:p>
             <w:pPr>
@@ -133,10 +139,10 @@
             </w:pPr>
             <w:r>
               <w:rPr>
-                <w:rFonts w:ascii="Calibri" w:hAnsi="Calibri"/>
+                <w:rFonts w:ascii="Arial" w:hAnsi="Arial"/>
                 <w:b/>
                 <w:color w:val="FFFFFF"/>
-                <w:sz w:val="18"/>
+                <w:sz w:val="17"/>
               </w:rPr>
               <w:t>Management conclusion</w:t>
             </w:r>
@@ -147,13 +153,14 @@
         <w:tc>
           <w:tcPr>
             <w:tcW w:type="dxa" w:w="5040"/>
+            <w:vAlign w:val="center"/>
           </w:tcPr>
           <w:p>
             <w:r>
               <w:rPr>
-                <w:rFonts w:ascii="Calibri" w:hAnsi="Calibri"/>
+                <w:rFonts w:ascii="Arial" w:hAnsi="Arial"/>
                 <w:color w:val="1E1E1E"/>
-                <w:sz w:val="18"/>
+                <w:sz w:val="17"/>
               </w:rPr>
               <w:t>Project delivery</w:t>
             </w:r>
@@ -162,13 +169,14 @@
         <w:tc>
           <w:tcPr>
             <w:tcW w:type="dxa" w:w="5040"/>
+            <w:vAlign w:val="center"/>
           </w:tcPr>
           <w:p>
             <w:r>
               <w:rPr>
-                <w:rFonts w:ascii="Calibri" w:hAnsi="Calibri"/>
+                <w:rFonts w:ascii="Arial" w:hAnsi="Arial"/>
                 <w:color w:val="1E1E1E"/>
-                <w:sz w:val="18"/>
+                <w:sz w:val="17"/>
               </w:rPr>
               <w:t>The project produced notebooks, trained models, FMA test outputs, external-song outputs, documentation, and notebook PDFs.</w:t>
             </w:r>
@@ -179,13 +187,14 @@
         <w:tc>
           <w:tcPr>
             <w:tcW w:type="dxa" w:w="5040"/>
+            <w:vAlign w:val="center"/>
           </w:tcPr>
           <w:p>
             <w:r>
               <w:rPr>
-                <w:rFonts w:ascii="Calibri" w:hAnsi="Calibri"/>
+                <w:rFonts w:ascii="Arial" w:hAnsi="Arial"/>
                 <w:color w:val="1E1E1E"/>
-                <w:sz w:val="18"/>
+                <w:sz w:val="17"/>
               </w:rPr>
               <w:t>Best use case</w:t>
             </w:r>
@@ -194,15 +203,16 @@
         <w:tc>
           <w:tcPr>
             <w:tcW w:type="dxa" w:w="5040"/>
+            <w:vAlign w:val="center"/>
           </w:tcPr>
           <w:p>
             <w:r>
               <w:rPr>
-                <w:rFonts w:ascii="Calibri" w:hAnsi="Calibri"/>
+                <w:rFonts w:ascii="Arial" w:hAnsi="Arial"/>
                 <w:color w:val="1E1E1E"/>
-                <w:sz w:val="18"/>
+                <w:sz w:val="17"/>
               </w:rPr>
-              <w:t>Ranked genre recommendation, audio catalogueue support, exploratory tagging, and retrieval assistance.</w:t>
+              <w:t>Ranked genre recommendation, audio catalogue support, exploratory tagging, and retrieval assistance.</w:t>
             </w:r>
           </w:p>
         </w:tc>
@@ -211,13 +221,14 @@
         <w:tc>
           <w:tcPr>
             <w:tcW w:type="dxa" w:w="5040"/>
+            <w:vAlign w:val="center"/>
           </w:tcPr>
           <w:p>
             <w:r>
               <w:rPr>
-                <w:rFonts w:ascii="Calibri" w:hAnsi="Calibri"/>
+                <w:rFonts w:ascii="Arial" w:hAnsi="Arial"/>
                 <w:color w:val="1E1E1E"/>
-                <w:sz w:val="18"/>
+                <w:sz w:val="17"/>
               </w:rPr>
               <w:t>Formal FMA performance</w:t>
             </w:r>
@@ -226,13 +237,14 @@
         <w:tc>
           <w:tcPr>
             <w:tcW w:type="dxa" w:w="5040"/>
+            <w:vAlign w:val="center"/>
           </w:tcPr>
           <w:p>
             <w:r>
               <w:rPr>
-                <w:rFonts w:ascii="Calibri" w:hAnsi="Calibri"/>
+                <w:rFonts w:ascii="Arial" w:hAnsi="Arial"/>
                 <w:color w:val="1E1E1E"/>
-                <w:sz w:val="18"/>
+                <w:sz w:val="17"/>
               </w:rPr>
               <w:t>Notebook 49 reported Top-1 hit-any 72.0%, Top-3 98.0%, and Top-5 99.0% on the processed FMA test batch.</w:t>
             </w:r>
@@ -243,13 +255,14 @@
         <w:tc>
           <w:tcPr>
             <w:tcW w:type="dxa" w:w="5040"/>
+            <w:vAlign w:val="center"/>
           </w:tcPr>
           <w:p>
             <w:r>
               <w:rPr>
-                <w:rFonts w:ascii="Calibri" w:hAnsi="Calibri"/>
+                <w:rFonts w:ascii="Arial" w:hAnsi="Arial"/>
                 <w:color w:val="1E1E1E"/>
-                <w:sz w:val="18"/>
+                <w:sz w:val="17"/>
               </w:rPr>
               <w:t>External-song performance</w:t>
             </w:r>
@@ -258,13 +271,14 @@
         <w:tc>
           <w:tcPr>
             <w:tcW w:type="dxa" w:w="5040"/>
+            <w:vAlign w:val="center"/>
           </w:tcPr>
           <w:p>
             <w:r>
               <w:rPr>
-                <w:rFonts w:ascii="Calibri" w:hAnsi="Calibri"/>
+                <w:rFonts w:ascii="Arial" w:hAnsi="Arial"/>
                 <w:color w:val="1E1E1E"/>
-                <w:sz w:val="18"/>
+                <w:sz w:val="17"/>
               </w:rPr>
               <w:t>Notebook 50 reported Top-1 21.7%, Top-3 66.7%, and Top-5 83.3% on 60 external open-licence songs.</w:t>
             </w:r>
@@ -275,13 +289,14 @@
         <w:tc>
           <w:tcPr>
             <w:tcW w:type="dxa" w:w="5040"/>
+            <w:vAlign w:val="center"/>
           </w:tcPr>
           <w:p>
             <w:r>
               <w:rPr>
-                <w:rFonts w:ascii="Calibri" w:hAnsi="Calibri"/>
+                <w:rFonts w:ascii="Arial" w:hAnsi="Arial"/>
                 <w:color w:val="1E1E1E"/>
-                <w:sz w:val="18"/>
+                <w:sz w:val="17"/>
               </w:rPr>
               <w:t>Primary limitation</w:t>
             </w:r>
@@ -290,13 +305,14 @@
         <w:tc>
           <w:tcPr>
             <w:tcW w:type="dxa" w:w="5040"/>
+            <w:vAlign w:val="center"/>
           </w:tcPr>
           <w:p>
             <w:r>
               <w:rPr>
-                <w:rFonts w:ascii="Calibri" w:hAnsi="Calibri"/>
+                <w:rFonts w:ascii="Arial" w:hAnsi="Arial"/>
                 <w:color w:val="1E1E1E"/>
-                <w:sz w:val="18"/>
+                <w:sz w:val="17"/>
               </w:rPr>
               <w:t>The system is still affected by class imbalance, broad-label bias, and weaker rare-label performance.</w:t>
             </w:r>
@@ -307,13 +323,14 @@
         <w:tc>
           <w:tcPr>
             <w:tcW w:type="dxa" w:w="5040"/>
+            <w:vAlign w:val="center"/>
           </w:tcPr>
           <w:p>
             <w:r>
               <w:rPr>
-                <w:rFonts w:ascii="Calibri" w:hAnsi="Calibri"/>
+                <w:rFonts w:ascii="Arial" w:hAnsi="Arial"/>
                 <w:color w:val="1E1E1E"/>
-                <w:sz w:val="18"/>
+                <w:sz w:val="17"/>
               </w:rPr>
               <w:t>Recommendation</w:t>
             </w:r>
@@ -322,13 +339,14 @@
         <w:tc>
           <w:tcPr>
             <w:tcW w:type="dxa" w:w="5040"/>
+            <w:vAlign w:val="center"/>
           </w:tcPr>
           <w:p>
             <w:r>
               <w:rPr>
-                <w:rFonts w:ascii="Calibri" w:hAnsi="Calibri"/>
+                <w:rFonts w:ascii="Arial" w:hAnsi="Arial"/>
                 <w:color w:val="1E1E1E"/>
-                <w:sz w:val="18"/>
+                <w:sz w:val="17"/>
               </w:rPr>
               <w:t>Present the system as a working academic prototype for ranked review. Keep production claims out until calibration and wider external testing improve.</w:t>
             </w:r>
@@ -354,18 +372,63 @@
         <w:jc w:val="center"/>
       </w:pPr>
       <w:r>
-        <w:rPr>
-          <w:rFonts w:ascii="Calibri" w:hAnsi="Calibri"/>
-          <w:i/>
-          <w:color w:val="5A5A5A"/>
-          <w:sz w:val="18"/>
-        </w:rPr>
-        <w:t>Figure 1. Management-level summary of final evaluation results.</w:t>
+        <w:drawing>
+          <wp:inline xmlns:a="http://schemas.openxmlformats.org/drawingml/2006/main" xmlns:pic="http://schemas.openxmlformats.org/drawingml/2006/picture">
+            <wp:extent cx="6217920" cy="3303270"/>
+            <wp:docPr id="1" name="Picture 1"/>
+            <wp:cNvGraphicFramePr>
+              <a:graphicFrameLocks noChangeAspect="1"/>
+            </wp:cNvGraphicFramePr>
+            <a:graphic>
+              <a:graphicData uri="http://schemas.openxmlformats.org/drawingml/2006/picture">
+                <pic:pic>
+                  <pic:nvPicPr>
+                    <pic:cNvPr id="0" name="management_figure_1_topk_comparison.png"/>
+                    <pic:cNvPicPr/>
+                  </pic:nvPicPr>
+                  <pic:blipFill>
+                    <a:blip r:embed="rId13"/>
+                    <a:stretch>
+                      <a:fillRect/>
+                    </a:stretch>
+                  </pic:blipFill>
+                  <pic:spPr>
+                    <a:xfrm>
+                      <a:off x="0" y="0"/>
+                      <a:ext cx="6217920" cy="3303270"/>
+                    </a:xfrm>
+                    <a:prstGeom prst="rect"/>
+                  </pic:spPr>
+                </pic:pic>
+              </a:graphicData>
+            </a:graphic>
+          </wp:inline>
+        </w:drawing>
       </w:r>
     </w:p>
     <w:p>
-      <w:pPr/>
+      <w:pPr>
+        <w:jc w:val="center"/>
+      </w:pPr>
       <w:r>
+        <w:rPr>
+          <w:rFonts w:ascii="Arial" w:hAnsi="Arial"/>
+          <w:b/>
+          <w:color w:val="333333"/>
+          <w:sz w:val="18"/>
+        </w:rPr>
+        <w:t>Figure 1. Management-level summary of final Top-k evaluation results.</w:t>
+      </w:r>
+    </w:p>
+    <w:p>
+      <w:pPr>
+        <w:jc w:val="left"/>
+      </w:pPr>
+      <w:r>
+        <w:rPr>
+          <w:rFonts w:ascii="Arial" w:hAnsi="Arial"/>
+          <w:sz w:val="21"/>
+        </w:rPr>
         <w:t>Figure 1 gives the short version of the performance story. It should not be read as a claim that all genre tagging is solved. It shows that the FMA test outcome is strong under Top-k review, while the external test supports a more cautious deployment message.</w:t>
       </w:r>
     </w:p>
@@ -405,6 +468,7 @@
       <w:tblPr>
         <w:tblStyle w:val="TableGrid"/>
         <w:tblW w:type="auto" w:w="0"/>
+        <w:jc w:val="center"/>
         <w:tblLook w:firstColumn="1" w:firstRow="1" w:lastColumn="0" w:lastRow="0" w:noHBand="0" w:noVBand="1" w:val="04A0"/>
       </w:tblPr>
       <w:tblGrid>
@@ -416,7 +480,8 @@
         <w:tc>
           <w:tcPr>
             <w:tcW w:type="dxa" w:w="3360"/>
-            <w:shd w:fill="1F4D78"/>
+            <w:shd w:fill="0B3D3A"/>
+            <w:vAlign w:val="center"/>
           </w:tcPr>
           <w:p>
             <w:pPr>
@@ -424,10 +489,10 @@
             </w:pPr>
             <w:r>
               <w:rPr>
-                <w:rFonts w:ascii="Calibri" w:hAnsi="Calibri"/>
+                <w:rFonts w:ascii="Arial" w:hAnsi="Arial"/>
                 <w:b/>
                 <w:color w:val="FFFFFF"/>
-                <w:sz w:val="18"/>
+                <w:sz w:val="17"/>
               </w:rPr>
               <w:t>Delivery component</w:t>
             </w:r>
@@ -436,7 +501,8 @@
         <w:tc>
           <w:tcPr>
             <w:tcW w:type="dxa" w:w="3360"/>
-            <w:shd w:fill="1F4D78"/>
+            <w:shd w:fill="0B3D3A"/>
+            <w:vAlign w:val="center"/>
           </w:tcPr>
           <w:p>
             <w:pPr>
@@ -444,10 +510,10 @@
             </w:pPr>
             <w:r>
               <w:rPr>
-                <w:rFonts w:ascii="Calibri" w:hAnsi="Calibri"/>
+                <w:rFonts w:ascii="Arial" w:hAnsi="Arial"/>
                 <w:b/>
                 <w:color w:val="FFFFFF"/>
-                <w:sz w:val="18"/>
+                <w:sz w:val="17"/>
               </w:rPr>
               <w:t>Status</w:t>
             </w:r>
@@ -456,7 +522,8 @@
         <w:tc>
           <w:tcPr>
             <w:tcW w:type="dxa" w:w="3360"/>
-            <w:shd w:fill="1F4D78"/>
+            <w:shd w:fill="0B3D3A"/>
+            <w:vAlign w:val="center"/>
           </w:tcPr>
           <w:p>
             <w:pPr>
@@ -464,10 +531,10 @@
             </w:pPr>
             <w:r>
               <w:rPr>
-                <w:rFonts w:ascii="Calibri" w:hAnsi="Calibri"/>
+                <w:rFonts w:ascii="Arial" w:hAnsi="Arial"/>
                 <w:b/>
                 <w:color w:val="FFFFFF"/>
-                <w:sz w:val="18"/>
+                <w:sz w:val="17"/>
               </w:rPr>
               <w:t>Management value</w:t>
             </w:r>
@@ -478,13 +545,14 @@
         <w:tc>
           <w:tcPr>
             <w:tcW w:type="dxa" w:w="3360"/>
+            <w:vAlign w:val="center"/>
           </w:tcPr>
           <w:p>
             <w:r>
               <w:rPr>
-                <w:rFonts w:ascii="Calibri" w:hAnsi="Calibri"/>
+                <w:rFonts w:ascii="Arial" w:hAnsi="Arial"/>
                 <w:color w:val="1E1E1E"/>
-                <w:sz w:val="18"/>
+                <w:sz w:val="17"/>
               </w:rPr>
               <w:t>Data foundation</w:t>
             </w:r>
@@ -493,13 +561,14 @@
         <w:tc>
           <w:tcPr>
             <w:tcW w:type="dxa" w:w="3360"/>
+            <w:vAlign w:val="center"/>
           </w:tcPr>
           <w:p>
             <w:r>
               <w:rPr>
-                <w:rFonts w:ascii="Calibri" w:hAnsi="Calibri"/>
+                <w:rFonts w:ascii="Arial" w:hAnsi="Arial"/>
                 <w:color w:val="1E1E1E"/>
-                <w:sz w:val="18"/>
+                <w:sz w:val="17"/>
               </w:rPr>
               <w:t>Completed</w:t>
             </w:r>
@@ -508,13 +577,14 @@
         <w:tc>
           <w:tcPr>
             <w:tcW w:type="dxa" w:w="3360"/>
+            <w:vAlign w:val="center"/>
           </w:tcPr>
           <w:p>
             <w:r>
               <w:rPr>
-                <w:rFonts w:ascii="Calibri" w:hAnsi="Calibri"/>
+                <w:rFonts w:ascii="Arial" w:hAnsi="Arial"/>
                 <w:color w:val="1E1E1E"/>
-                <w:sz w:val="18"/>
+                <w:sz w:val="17"/>
               </w:rPr>
               <w:t>FMA metadata, genre hierarchy, engineered features, raw audio paths, and external manifest data were organised for modelling and evaluation.</w:t>
             </w:r>
@@ -525,13 +595,14 @@
         <w:tc>
           <w:tcPr>
             <w:tcW w:type="dxa" w:w="3360"/>
+            <w:vAlign w:val="center"/>
           </w:tcPr>
           <w:p>
             <w:r>
               <w:rPr>
-                <w:rFonts w:ascii="Calibri" w:hAnsi="Calibri"/>
+                <w:rFonts w:ascii="Arial" w:hAnsi="Arial"/>
                 <w:color w:val="1E1E1E"/>
-                <w:sz w:val="18"/>
+                <w:sz w:val="17"/>
               </w:rPr>
               <w:t>Model development</w:t>
             </w:r>
@@ -540,13 +611,14 @@
         <w:tc>
           <w:tcPr>
             <w:tcW w:type="dxa" w:w="3360"/>
+            <w:vAlign w:val="center"/>
           </w:tcPr>
           <w:p>
             <w:r>
               <w:rPr>
-                <w:rFonts w:ascii="Calibri" w:hAnsi="Calibri"/>
+                <w:rFonts w:ascii="Arial" w:hAnsi="Arial"/>
                 <w:color w:val="1E1E1E"/>
-                <w:sz w:val="18"/>
+                <w:sz w:val="17"/>
               </w:rPr>
               <w:t>Completed</w:t>
             </w:r>
@@ -555,13 +627,14 @@
         <w:tc>
           <w:tcPr>
             <w:tcW w:type="dxa" w:w="3360"/>
+            <w:vAlign w:val="center"/>
           </w:tcPr>
           <w:p>
             <w:r>
               <w:rPr>
-                <w:rFonts w:ascii="Calibri" w:hAnsi="Calibri"/>
+                <w:rFonts w:ascii="Arial" w:hAnsi="Arial"/>
                 <w:color w:val="1E1E1E"/>
-                <w:sz w:val="18"/>
+                <w:sz w:val="17"/>
               </w:rPr>
               <w:t>The notebooks built and compared structured, audio CNN, and hybrid branches.</w:t>
             </w:r>
@@ -572,13 +645,14 @@
         <w:tc>
           <w:tcPr>
             <w:tcW w:type="dxa" w:w="3360"/>
+            <w:vAlign w:val="center"/>
           </w:tcPr>
           <w:p>
             <w:r>
               <w:rPr>
-                <w:rFonts w:ascii="Calibri" w:hAnsi="Calibri"/>
+                <w:rFonts w:ascii="Arial" w:hAnsi="Arial"/>
                 <w:color w:val="1E1E1E"/>
-                <w:sz w:val="18"/>
+                <w:sz w:val="17"/>
               </w:rPr>
               <w:t>Final FMA evaluation</w:t>
             </w:r>
@@ -587,13 +661,14 @@
         <w:tc>
           <w:tcPr>
             <w:tcW w:type="dxa" w:w="3360"/>
+            <w:vAlign w:val="center"/>
           </w:tcPr>
           <w:p>
             <w:r>
               <w:rPr>
-                <w:rFonts w:ascii="Calibri" w:hAnsi="Calibri"/>
+                <w:rFonts w:ascii="Arial" w:hAnsi="Arial"/>
                 <w:color w:val="1E1E1E"/>
-                <w:sz w:val="18"/>
+                <w:sz w:val="17"/>
               </w:rPr>
               <w:t>Completed</w:t>
             </w:r>
@@ -602,13 +677,14 @@
         <w:tc>
           <w:tcPr>
             <w:tcW w:type="dxa" w:w="3360"/>
+            <w:vAlign w:val="center"/>
           </w:tcPr>
           <w:p>
             <w:r>
               <w:rPr>
-                <w:rFonts w:ascii="Calibri" w:hAnsi="Calibri"/>
+                <w:rFonts w:ascii="Arial" w:hAnsi="Arial"/>
                 <w:color w:val="1E1E1E"/>
-                <w:sz w:val="18"/>
+                <w:sz w:val="17"/>
               </w:rPr>
               <w:t>Notebook 49 provides the formal FMA test-split evidence.</w:t>
             </w:r>
@@ -619,13 +695,14 @@
         <w:tc>
           <w:tcPr>
             <w:tcW w:type="dxa" w:w="3360"/>
+            <w:vAlign w:val="center"/>
           </w:tcPr>
           <w:p>
             <w:r>
               <w:rPr>
-                <w:rFonts w:ascii="Calibri" w:hAnsi="Calibri"/>
+                <w:rFonts w:ascii="Arial" w:hAnsi="Arial"/>
                 <w:color w:val="1E1E1E"/>
-                <w:sz w:val="18"/>
+                <w:sz w:val="17"/>
               </w:rPr>
               <w:t>External audio evaluation</w:t>
             </w:r>
@@ -634,13 +711,14 @@
         <w:tc>
           <w:tcPr>
             <w:tcW w:type="dxa" w:w="3360"/>
+            <w:vAlign w:val="center"/>
           </w:tcPr>
           <w:p>
             <w:r>
               <w:rPr>
-                <w:rFonts w:ascii="Calibri" w:hAnsi="Calibri"/>
+                <w:rFonts w:ascii="Arial" w:hAnsi="Arial"/>
                 <w:color w:val="1E1E1E"/>
-                <w:sz w:val="18"/>
+                <w:sz w:val="17"/>
               </w:rPr>
               <w:t>Completed</w:t>
             </w:r>
@@ -649,13 +727,14 @@
         <w:tc>
           <w:tcPr>
             <w:tcW w:type="dxa" w:w="3360"/>
+            <w:vAlign w:val="center"/>
           </w:tcPr>
           <w:p>
             <w:r>
               <w:rPr>
-                <w:rFonts w:ascii="Calibri" w:hAnsi="Calibri"/>
+                <w:rFonts w:ascii="Arial" w:hAnsi="Arial"/>
                 <w:color w:val="1E1E1E"/>
-                <w:sz w:val="18"/>
+                <w:sz w:val="17"/>
               </w:rPr>
               <w:t>Notebook 50 tests open-licence songs outside FMA.</w:t>
             </w:r>
@@ -666,13 +745,14 @@
         <w:tc>
           <w:tcPr>
             <w:tcW w:type="dxa" w:w="3360"/>
+            <w:vAlign w:val="center"/>
           </w:tcPr>
           <w:p>
             <w:r>
               <w:rPr>
-                <w:rFonts w:ascii="Calibri" w:hAnsi="Calibri"/>
+                <w:rFonts w:ascii="Arial" w:hAnsi="Arial"/>
                 <w:color w:val="1E1E1E"/>
-                <w:sz w:val="18"/>
+                <w:sz w:val="17"/>
               </w:rPr>
               <w:t>Documentation</w:t>
             </w:r>
@@ -681,13 +761,14 @@
         <w:tc>
           <w:tcPr>
             <w:tcW w:type="dxa" w:w="3360"/>
+            <w:vAlign w:val="center"/>
           </w:tcPr>
           <w:p>
             <w:r>
               <w:rPr>
-                <w:rFonts w:ascii="Calibri" w:hAnsi="Calibri"/>
+                <w:rFonts w:ascii="Arial" w:hAnsi="Arial"/>
                 <w:color w:val="1E1E1E"/>
-                <w:sz w:val="18"/>
+                <w:sz w:val="17"/>
               </w:rPr>
               <w:t>Completed</w:t>
             </w:r>
@@ -696,13 +777,14 @@
         <w:tc>
           <w:tcPr>
             <w:tcW w:type="dxa" w:w="3360"/>
+            <w:vAlign w:val="center"/>
           </w:tcPr>
           <w:p>
             <w:r>
               <w:rPr>
-                <w:rFonts w:ascii="Calibri" w:hAnsi="Calibri"/>
+                <w:rFonts w:ascii="Arial" w:hAnsi="Arial"/>
                 <w:color w:val="1E1E1E"/>
-                <w:sz w:val="18"/>
+                <w:sz w:val="17"/>
               </w:rPr>
               <w:t>Technical paper, graded proposal, readiness report, and file manifests are organised in the project folder.</w:t>
             </w:r>
@@ -713,13 +795,14 @@
         <w:tc>
           <w:tcPr>
             <w:tcW w:type="dxa" w:w="3360"/>
+            <w:vAlign w:val="center"/>
           </w:tcPr>
           <w:p>
             <w:r>
               <w:rPr>
-                <w:rFonts w:ascii="Calibri" w:hAnsi="Calibri"/>
+                <w:rFonts w:ascii="Arial" w:hAnsi="Arial"/>
                 <w:color w:val="1E1E1E"/>
-                <w:sz w:val="18"/>
+                <w:sz w:val="17"/>
               </w:rPr>
               <w:t>Software files</w:t>
             </w:r>
@@ -728,13 +811,14 @@
         <w:tc>
           <w:tcPr>
             <w:tcW w:type="dxa" w:w="3360"/>
+            <w:vAlign w:val="center"/>
           </w:tcPr>
           <w:p>
             <w:r>
               <w:rPr>
-                <w:rFonts w:ascii="Calibri" w:hAnsi="Calibri"/>
+                <w:rFonts w:ascii="Arial" w:hAnsi="Arial"/>
                 <w:color w:val="1E1E1E"/>
-                <w:sz w:val="18"/>
+                <w:sz w:val="17"/>
               </w:rPr>
               <w:t>Completed</w:t>
             </w:r>
@@ -743,13 +827,14 @@
         <w:tc>
           <w:tcPr>
             <w:tcW w:type="dxa" w:w="3360"/>
+            <w:vAlign w:val="center"/>
           </w:tcPr>
           <w:p>
             <w:r>
               <w:rPr>
-                <w:rFonts w:ascii="Calibri" w:hAnsi="Calibri"/>
+                <w:rFonts w:ascii="Arial" w:hAnsi="Arial"/>
                 <w:color w:val="1E1E1E"/>
-                <w:sz w:val="18"/>
+                <w:sz w:val="17"/>
               </w:rPr>
               <w:t>All notebooks were exported to PDF with code and visible outputs.</w:t>
             </w:r>
@@ -852,18 +937,63 @@
         <w:jc w:val="center"/>
       </w:pPr>
       <w:r>
+        <w:drawing>
+          <wp:inline xmlns:a="http://schemas.openxmlformats.org/drawingml/2006/main" xmlns:pic="http://schemas.openxmlformats.org/drawingml/2006/picture">
+            <wp:extent cx="6217920" cy="3303270"/>
+            <wp:docPr id="2" name="Picture 2"/>
+            <wp:cNvGraphicFramePr>
+              <a:graphicFrameLocks noChangeAspect="1"/>
+            </wp:cNvGraphicFramePr>
+            <a:graphic>
+              <a:graphicData uri="http://schemas.openxmlformats.org/drawingml/2006/picture">
+                <pic:pic>
+                  <pic:nvPicPr>
+                    <pic:cNvPr id="0" name="management_figure_2_external_genre_topk.png"/>
+                    <pic:cNvPicPr/>
+                  </pic:nvPicPr>
+                  <pic:blipFill>
+                    <a:blip r:embed="rId14"/>
+                    <a:stretch>
+                      <a:fillRect/>
+                    </a:stretch>
+                  </pic:blipFill>
+                  <pic:spPr>
+                    <a:xfrm>
+                      <a:off x="0" y="0"/>
+                      <a:ext cx="6217920" cy="3303270"/>
+                    </a:xfrm>
+                    <a:prstGeom prst="rect"/>
+                  </pic:spPr>
+                </pic:pic>
+              </a:graphicData>
+            </a:graphic>
+          </wp:inline>
+        </w:drawing>
+      </w:r>
+    </w:p>
+    <w:p>
+      <w:pPr>
+        <w:jc w:val="center"/>
+      </w:pPr>
+      <w:r>
         <w:rPr>
-          <w:rFonts w:ascii="Calibri" w:hAnsi="Calibri"/>
-          <w:i/>
-          <w:color w:val="5A5A5A"/>
+          <w:rFonts w:ascii="Arial" w:hAnsi="Arial"/>
+          <w:b/>
+          <w:color w:val="333333"/>
           <w:sz w:val="18"/>
         </w:rPr>
         <w:t>Figure 2. External-song Top-k performance by expected genre.</w:t>
       </w:r>
     </w:p>
     <w:p>
-      <w:pPr/>
+      <w:pPr>
+        <w:jc w:val="left"/>
+      </w:pPr>
       <w:r>
+        <w:rPr>
+          <w:rFonts w:ascii="Arial" w:hAnsi="Arial"/>
+          <w:sz w:val="21"/>
+        </w:rPr>
         <w:t>Figure 2 is useful for management because it shows where future testing should focus. Uneven genre performance suggests that a larger and more varied external test set would be needed before operational rollout.</w:t>
       </w:r>
     </w:p>
@@ -922,6 +1052,7 @@
       <w:tblPr>
         <w:tblStyle w:val="TableGrid"/>
         <w:tblW w:type="auto" w:w="0"/>
+        <w:jc w:val="center"/>
         <w:tblLook w:firstColumn="1" w:firstRow="1" w:lastColumn="0" w:lastRow="0" w:noHBand="0" w:noVBand="1" w:val="04A0"/>
       </w:tblPr>
       <w:tblGrid>
@@ -933,7 +1064,8 @@
         <w:tc>
           <w:tcPr>
             <w:tcW w:type="dxa" w:w="3360"/>
-            <w:shd w:fill="1F4D78"/>
+            <w:shd w:fill="0B3D3A"/>
+            <w:vAlign w:val="center"/>
           </w:tcPr>
           <w:p>
             <w:pPr>
@@ -941,10 +1073,10 @@
             </w:pPr>
             <w:r>
               <w:rPr>
-                <w:rFonts w:ascii="Calibri" w:hAnsi="Calibri"/>
+                <w:rFonts w:ascii="Arial" w:hAnsi="Arial"/>
                 <w:b/>
                 <w:color w:val="FFFFFF"/>
-                <w:sz w:val="18"/>
+                <w:sz w:val="17"/>
               </w:rPr>
               <w:t>Use case</w:t>
             </w:r>
@@ -953,7 +1085,8 @@
         <w:tc>
           <w:tcPr>
             <w:tcW w:type="dxa" w:w="3360"/>
-            <w:shd w:fill="1F4D78"/>
+            <w:shd w:fill="0B3D3A"/>
+            <w:vAlign w:val="center"/>
           </w:tcPr>
           <w:p>
             <w:pPr>
@@ -961,10 +1094,10 @@
             </w:pPr>
             <w:r>
               <w:rPr>
-                <w:rFonts w:ascii="Calibri" w:hAnsi="Calibri"/>
+                <w:rFonts w:ascii="Arial" w:hAnsi="Arial"/>
                 <w:b/>
                 <w:color w:val="FFFFFF"/>
-                <w:sz w:val="18"/>
+                <w:sz w:val="17"/>
               </w:rPr>
               <w:t>Readiness</w:t>
             </w:r>
@@ -973,7 +1106,8 @@
         <w:tc>
           <w:tcPr>
             <w:tcW w:type="dxa" w:w="3360"/>
-            <w:shd w:fill="1F4D78"/>
+            <w:shd w:fill="0B3D3A"/>
+            <w:vAlign w:val="center"/>
           </w:tcPr>
           <w:p>
             <w:pPr>
@@ -981,10 +1115,10 @@
             </w:pPr>
             <w:r>
               <w:rPr>
-                <w:rFonts w:ascii="Calibri" w:hAnsi="Calibri"/>
+                <w:rFonts w:ascii="Arial" w:hAnsi="Arial"/>
                 <w:b/>
                 <w:color w:val="FFFFFF"/>
-                <w:sz w:val="18"/>
+                <w:sz w:val="17"/>
               </w:rPr>
               <w:t>Comment</w:t>
             </w:r>
@@ -995,13 +1129,14 @@
         <w:tc>
           <w:tcPr>
             <w:tcW w:type="dxa" w:w="3360"/>
+            <w:vAlign w:val="center"/>
           </w:tcPr>
           <w:p>
             <w:r>
               <w:rPr>
-                <w:rFonts w:ascii="Calibri" w:hAnsi="Calibri"/>
+                <w:rFonts w:ascii="Arial" w:hAnsi="Arial"/>
                 <w:color w:val="1E1E1E"/>
-                <w:sz w:val="18"/>
+                <w:sz w:val="17"/>
               </w:rPr>
               <w:t>Academic demonstration</w:t>
             </w:r>
@@ -1010,13 +1145,14 @@
         <w:tc>
           <w:tcPr>
             <w:tcW w:type="dxa" w:w="3360"/>
+            <w:vAlign w:val="center"/>
           </w:tcPr>
           <w:p>
             <w:r>
               <w:rPr>
-                <w:rFonts w:ascii="Calibri" w:hAnsi="Calibri"/>
+                <w:rFonts w:ascii="Arial" w:hAnsi="Arial"/>
                 <w:color w:val="1E1E1E"/>
-                <w:sz w:val="18"/>
+                <w:sz w:val="17"/>
               </w:rPr>
               <w:t>Ready</w:t>
             </w:r>
@@ -1025,13 +1161,14 @@
         <w:tc>
           <w:tcPr>
             <w:tcW w:type="dxa" w:w="3360"/>
+            <w:vAlign w:val="center"/>
           </w:tcPr>
           <w:p>
             <w:r>
               <w:rPr>
-                <w:rFonts w:ascii="Calibri" w:hAnsi="Calibri"/>
+                <w:rFonts w:ascii="Arial" w:hAnsi="Arial"/>
                 <w:color w:val="1E1E1E"/>
-                <w:sz w:val="18"/>
+                <w:sz w:val="17"/>
               </w:rPr>
               <w:t>The project is complete and backed by notebooks, outputs, documents, and software files.</w:t>
             </w:r>
@@ -1042,13 +1179,14 @@
         <w:tc>
           <w:tcPr>
             <w:tcW w:type="dxa" w:w="3360"/>
+            <w:vAlign w:val="center"/>
           </w:tcPr>
           <w:p>
             <w:r>
               <w:rPr>
-                <w:rFonts w:ascii="Calibri" w:hAnsi="Calibri"/>
+                <w:rFonts w:ascii="Arial" w:hAnsi="Arial"/>
                 <w:color w:val="1E1E1E"/>
-                <w:sz w:val="18"/>
+                <w:sz w:val="17"/>
               </w:rPr>
               <w:t>Batch candidate tagging</w:t>
             </w:r>
@@ -1057,13 +1195,14 @@
         <w:tc>
           <w:tcPr>
             <w:tcW w:type="dxa" w:w="3360"/>
+            <w:vAlign w:val="center"/>
           </w:tcPr>
           <w:p>
             <w:r>
               <w:rPr>
-                <w:rFonts w:ascii="Calibri" w:hAnsi="Calibri"/>
+                <w:rFonts w:ascii="Arial" w:hAnsi="Arial"/>
                 <w:color w:val="1E1E1E"/>
-                <w:sz w:val="18"/>
+                <w:sz w:val="17"/>
               </w:rPr>
               <w:t>Partially ready</w:t>
             </w:r>
@@ -1072,13 +1211,14 @@
         <w:tc>
           <w:tcPr>
             <w:tcW w:type="dxa" w:w="3360"/>
+            <w:vAlign w:val="center"/>
           </w:tcPr>
           <w:p>
             <w:r>
               <w:rPr>
-                <w:rFonts w:ascii="Calibri" w:hAnsi="Calibri"/>
+                <w:rFonts w:ascii="Arial" w:hAnsi="Arial"/>
                 <w:color w:val="1E1E1E"/>
-                <w:sz w:val="18"/>
+                <w:sz w:val="17"/>
               </w:rPr>
               <w:t>Useful for ranked genre suggestions, especially with Top-3 or Top-5 review.</w:t>
             </w:r>
@@ -1089,13 +1229,14 @@
         <w:tc>
           <w:tcPr>
             <w:tcW w:type="dxa" w:w="3360"/>
+            <w:vAlign w:val="center"/>
           </w:tcPr>
           <w:p>
             <w:r>
               <w:rPr>
-                <w:rFonts w:ascii="Calibri" w:hAnsi="Calibri"/>
+                <w:rFonts w:ascii="Arial" w:hAnsi="Arial"/>
                 <w:color w:val="1E1E1E"/>
-                <w:sz w:val="18"/>
+                <w:sz w:val="17"/>
               </w:rPr>
               <w:t>Automated final tagging</w:t>
             </w:r>
@@ -1104,13 +1245,14 @@
         <w:tc>
           <w:tcPr>
             <w:tcW w:type="dxa" w:w="3360"/>
+            <w:vAlign w:val="center"/>
           </w:tcPr>
           <w:p>
             <w:r>
               <w:rPr>
-                <w:rFonts w:ascii="Calibri" w:hAnsi="Calibri"/>
+                <w:rFonts w:ascii="Arial" w:hAnsi="Arial"/>
                 <w:color w:val="1E1E1E"/>
-                <w:sz w:val="18"/>
+                <w:sz w:val="17"/>
               </w:rPr>
               <w:t>Not yet ready</w:t>
             </w:r>
@@ -1119,13 +1261,14 @@
         <w:tc>
           <w:tcPr>
             <w:tcW w:type="dxa" w:w="3360"/>
+            <w:vAlign w:val="center"/>
           </w:tcPr>
           <w:p>
             <w:r>
               <w:rPr>
-                <w:rFonts w:ascii="Calibri" w:hAnsi="Calibri"/>
+                <w:rFonts w:ascii="Arial" w:hAnsi="Arial"/>
                 <w:color w:val="1E1E1E"/>
-                <w:sz w:val="18"/>
+                <w:sz w:val="17"/>
               </w:rPr>
               <w:t>Requires better calibration, confidence policy, and larger external validation.</w:t>
             </w:r>
@@ -1136,13 +1279,14 @@
         <w:tc>
           <w:tcPr>
             <w:tcW w:type="dxa" w:w="3360"/>
+            <w:vAlign w:val="center"/>
           </w:tcPr>
           <w:p>
             <w:r>
               <w:rPr>
-                <w:rFonts w:ascii="Calibri" w:hAnsi="Calibri"/>
+                <w:rFonts w:ascii="Arial" w:hAnsi="Arial"/>
                 <w:color w:val="1E1E1E"/>
-                <w:sz w:val="18"/>
+                <w:sz w:val="17"/>
               </w:rPr>
               <w:t>Rare-tail genre discovery</w:t>
             </w:r>
@@ -1151,13 +1295,14 @@
         <w:tc>
           <w:tcPr>
             <w:tcW w:type="dxa" w:w="3360"/>
+            <w:vAlign w:val="center"/>
           </w:tcPr>
           <w:p>
             <w:r>
               <w:rPr>
-                <w:rFonts w:ascii="Calibri" w:hAnsi="Calibri"/>
+                <w:rFonts w:ascii="Arial" w:hAnsi="Arial"/>
                 <w:color w:val="1E1E1E"/>
-                <w:sz w:val="18"/>
+                <w:sz w:val="17"/>
               </w:rPr>
               <w:t>Limited</w:t>
             </w:r>
@@ -1166,13 +1311,14 @@
         <w:tc>
           <w:tcPr>
             <w:tcW w:type="dxa" w:w="3360"/>
+            <w:vAlign w:val="center"/>
           </w:tcPr>
           <w:p>
             <w:r>
               <w:rPr>
-                <w:rFonts w:ascii="Calibri" w:hAnsi="Calibri"/>
+                <w:rFonts w:ascii="Arial" w:hAnsi="Arial"/>
                 <w:color w:val="1E1E1E"/>
-                <w:sz w:val="18"/>
+                <w:sz w:val="17"/>
               </w:rPr>
               <w:t>Rare genres remain difficult due to data sparsity and should be treated cautiously.</w:t>
             </w:r>
@@ -1211,6 +1357,7 @@
       <w:tblPr>
         <w:tblStyle w:val="TableGrid"/>
         <w:tblW w:type="auto" w:w="0"/>
+        <w:jc w:val="center"/>
         <w:tblLook w:firstColumn="1" w:firstRow="1" w:lastColumn="0" w:lastRow="0" w:noHBand="0" w:noVBand="1" w:val="04A0"/>
       </w:tblPr>
       <w:tblGrid>
@@ -1222,7 +1369,8 @@
         <w:tc>
           <w:tcPr>
             <w:tcW w:type="dxa" w:w="3360"/>
-            <w:shd w:fill="1F4D78"/>
+            <w:shd w:fill="0B3D3A"/>
+            <w:vAlign w:val="center"/>
           </w:tcPr>
           <w:p>
             <w:pPr>
@@ -1230,10 +1378,10 @@
             </w:pPr>
             <w:r>
               <w:rPr>
-                <w:rFonts w:ascii="Calibri" w:hAnsi="Calibri"/>
+                <w:rFonts w:ascii="Arial" w:hAnsi="Arial"/>
                 <w:b/>
                 <w:color w:val="FFFFFF"/>
-                <w:sz w:val="18"/>
+                <w:sz w:val="17"/>
               </w:rPr>
               <w:t>Risk</w:t>
             </w:r>
@@ -1242,7 +1390,8 @@
         <w:tc>
           <w:tcPr>
             <w:tcW w:type="dxa" w:w="3360"/>
-            <w:shd w:fill="1F4D78"/>
+            <w:shd w:fill="0B3D3A"/>
+            <w:vAlign w:val="center"/>
           </w:tcPr>
           <w:p>
             <w:pPr>
@@ -1250,10 +1399,10 @@
             </w:pPr>
             <w:r>
               <w:rPr>
-                <w:rFonts w:ascii="Calibri" w:hAnsi="Calibri"/>
+                <w:rFonts w:ascii="Arial" w:hAnsi="Arial"/>
                 <w:b/>
                 <w:color w:val="FFFFFF"/>
-                <w:sz w:val="18"/>
+                <w:sz w:val="17"/>
               </w:rPr>
               <w:t>Impact</w:t>
             </w:r>
@@ -1262,7 +1411,8 @@
         <w:tc>
           <w:tcPr>
             <w:tcW w:type="dxa" w:w="3360"/>
-            <w:shd w:fill="1F4D78"/>
+            <w:shd w:fill="0B3D3A"/>
+            <w:vAlign w:val="center"/>
           </w:tcPr>
           <w:p>
             <w:pPr>
@@ -1270,10 +1420,10 @@
             </w:pPr>
             <w:r>
               <w:rPr>
-                <w:rFonts w:ascii="Calibri" w:hAnsi="Calibri"/>
+                <w:rFonts w:ascii="Arial" w:hAnsi="Arial"/>
                 <w:b/>
                 <w:color w:val="FFFFFF"/>
-                <w:sz w:val="18"/>
+                <w:sz w:val="17"/>
               </w:rPr>
               <w:t>Recommended control</w:t>
             </w:r>
@@ -1284,13 +1434,14 @@
         <w:tc>
           <w:tcPr>
             <w:tcW w:type="dxa" w:w="3360"/>
+            <w:vAlign w:val="center"/>
           </w:tcPr>
           <w:p>
             <w:r>
               <w:rPr>
-                <w:rFonts w:ascii="Calibri" w:hAnsi="Calibri"/>
+                <w:rFonts w:ascii="Arial" w:hAnsi="Arial"/>
                 <w:color w:val="1E1E1E"/>
-                <w:sz w:val="18"/>
+                <w:sz w:val="17"/>
               </w:rPr>
               <w:t>Class imbalance</w:t>
             </w:r>
@@ -1299,13 +1450,14 @@
         <w:tc>
           <w:tcPr>
             <w:tcW w:type="dxa" w:w="3360"/>
+            <w:vAlign w:val="center"/>
           </w:tcPr>
           <w:p>
             <w:r>
               <w:rPr>
-                <w:rFonts w:ascii="Calibri" w:hAnsi="Calibri"/>
+                <w:rFonts w:ascii="Arial" w:hAnsi="Arial"/>
                 <w:color w:val="1E1E1E"/>
-                <w:sz w:val="18"/>
+                <w:sz w:val="17"/>
               </w:rPr>
               <w:t>Common genres receive stronger predictions than rare genres.</w:t>
             </w:r>
@@ -1314,13 +1466,14 @@
         <w:tc>
           <w:tcPr>
             <w:tcW w:type="dxa" w:w="3360"/>
+            <w:vAlign w:val="center"/>
           </w:tcPr>
           <w:p>
             <w:r>
               <w:rPr>
-                <w:rFonts w:ascii="Calibri" w:hAnsi="Calibri"/>
+                <w:rFonts w:ascii="Arial" w:hAnsi="Arial"/>
                 <w:color w:val="1E1E1E"/>
-                <w:sz w:val="18"/>
+                <w:sz w:val="17"/>
               </w:rPr>
               <w:t>Use class balancing, augmentation, and hierarchy-aware evaluation in future work.</w:t>
             </w:r>
@@ -1331,13 +1484,14 @@
         <w:tc>
           <w:tcPr>
             <w:tcW w:type="dxa" w:w="3360"/>
+            <w:vAlign w:val="center"/>
           </w:tcPr>
           <w:p>
             <w:r>
               <w:rPr>
-                <w:rFonts w:ascii="Calibri" w:hAnsi="Calibri"/>
+                <w:rFonts w:ascii="Arial" w:hAnsi="Arial"/>
                 <w:color w:val="1E1E1E"/>
-                <w:sz w:val="18"/>
+                <w:sz w:val="17"/>
               </w:rPr>
               <w:t>External domain shift</w:t>
             </w:r>
@@ -1346,13 +1500,14 @@
         <w:tc>
           <w:tcPr>
             <w:tcW w:type="dxa" w:w="3360"/>
+            <w:vAlign w:val="center"/>
           </w:tcPr>
           <w:p>
             <w:r>
               <w:rPr>
-                <w:rFonts w:ascii="Calibri" w:hAnsi="Calibri"/>
+                <w:rFonts w:ascii="Arial" w:hAnsi="Arial"/>
                 <w:color w:val="1E1E1E"/>
-                <w:sz w:val="18"/>
+                <w:sz w:val="17"/>
               </w:rPr>
               <w:t>Songs outside FMA may not match the training distribution.</w:t>
             </w:r>
@@ -1361,13 +1516,14 @@
         <w:tc>
           <w:tcPr>
             <w:tcW w:type="dxa" w:w="3360"/>
+            <w:vAlign w:val="center"/>
           </w:tcPr>
           <w:p>
             <w:r>
               <w:rPr>
-                <w:rFonts w:ascii="Calibri" w:hAnsi="Calibri"/>
+                <w:rFonts w:ascii="Arial" w:hAnsi="Arial"/>
                 <w:color w:val="1E1E1E"/>
-                <w:sz w:val="18"/>
+                <w:sz w:val="17"/>
               </w:rPr>
               <w:t>Expand external test coverage and monitor confidence thresholds.</w:t>
             </w:r>
@@ -1378,13 +1534,14 @@
         <w:tc>
           <w:tcPr>
             <w:tcW w:type="dxa" w:w="3360"/>
+            <w:vAlign w:val="center"/>
           </w:tcPr>
           <w:p>
             <w:r>
               <w:rPr>
-                <w:rFonts w:ascii="Calibri" w:hAnsi="Calibri"/>
+                <w:rFonts w:ascii="Arial" w:hAnsi="Arial"/>
                 <w:color w:val="1E1E1E"/>
-                <w:sz w:val="18"/>
+                <w:sz w:val="17"/>
               </w:rPr>
               <w:t>Broad-label bias</w:t>
             </w:r>
@@ -1393,13 +1550,14 @@
         <w:tc>
           <w:tcPr>
             <w:tcW w:type="dxa" w:w="3360"/>
+            <w:vAlign w:val="center"/>
           </w:tcPr>
           <w:p>
             <w:r>
               <w:rPr>
-                <w:rFonts w:ascii="Calibri" w:hAnsi="Calibri"/>
+                <w:rFonts w:ascii="Arial" w:hAnsi="Arial"/>
                 <w:color w:val="1E1E1E"/>
-                <w:sz w:val="18"/>
+                <w:sz w:val="17"/>
               </w:rPr>
               <w:t>The model can over-select broad labels such as Experimental.</w:t>
             </w:r>
@@ -1408,13 +1566,14 @@
         <w:tc>
           <w:tcPr>
             <w:tcW w:type="dxa" w:w="3360"/>
+            <w:vAlign w:val="center"/>
           </w:tcPr>
           <w:p>
             <w:r>
               <w:rPr>
-                <w:rFonts w:ascii="Calibri" w:hAnsi="Calibri"/>
+                <w:rFonts w:ascii="Arial" w:hAnsi="Arial"/>
                 <w:color w:val="1E1E1E"/>
-                <w:sz w:val="18"/>
+                <w:sz w:val="17"/>
               </w:rPr>
               <w:t>Use calibration, genre-family constraints, and post-processing review rules.</w:t>
             </w:r>
@@ -1425,13 +1584,14 @@
         <w:tc>
           <w:tcPr>
             <w:tcW w:type="dxa" w:w="3360"/>
+            <w:vAlign w:val="center"/>
           </w:tcPr>
           <w:p>
             <w:r>
               <w:rPr>
-                <w:rFonts w:ascii="Calibri" w:hAnsi="Calibri"/>
+                <w:rFonts w:ascii="Arial" w:hAnsi="Arial"/>
                 <w:color w:val="1E1E1E"/>
-                <w:sz w:val="18"/>
+                <w:sz w:val="17"/>
               </w:rPr>
               <w:t>Rare-tail weakness</w:t>
             </w:r>
@@ -1440,13 +1600,14 @@
         <w:tc>
           <w:tcPr>
             <w:tcW w:type="dxa" w:w="3360"/>
+            <w:vAlign w:val="center"/>
           </w:tcPr>
           <w:p>
             <w:r>
               <w:rPr>
-                <w:rFonts w:ascii="Calibri" w:hAnsi="Calibri"/>
+                <w:rFonts w:ascii="Arial" w:hAnsi="Arial"/>
                 <w:color w:val="1E1E1E"/>
-                <w:sz w:val="18"/>
+                <w:sz w:val="17"/>
               </w:rPr>
               <w:t>Sparse labels remain difficult to predict directly.</w:t>
             </w:r>
@@ -1455,13 +1616,14 @@
         <w:tc>
           <w:tcPr>
             <w:tcW w:type="dxa" w:w="3360"/>
+            <w:vAlign w:val="center"/>
           </w:tcPr>
           <w:p>
             <w:r>
               <w:rPr>
-                <w:rFonts w:ascii="Calibri" w:hAnsi="Calibri"/>
+                <w:rFonts w:ascii="Arial" w:hAnsi="Arial"/>
                 <w:color w:val="1E1E1E"/>
-                <w:sz w:val="18"/>
+                <w:sz w:val="17"/>
               </w:rPr>
               <w:t>Keep rare-tail output as supportive suggestions unless more labelled data is collected.</w:t>
             </w:r>
@@ -1472,13 +1634,14 @@
         <w:tc>
           <w:tcPr>
             <w:tcW w:type="dxa" w:w="3360"/>
+            <w:vAlign w:val="center"/>
           </w:tcPr>
           <w:p>
             <w:r>
               <w:rPr>
-                <w:rFonts w:ascii="Calibri" w:hAnsi="Calibri"/>
+                <w:rFonts w:ascii="Arial" w:hAnsi="Arial"/>
                 <w:color w:val="1E1E1E"/>
-                <w:sz w:val="18"/>
+                <w:sz w:val="17"/>
               </w:rPr>
               <w:t>Single-label interpretation risk</w:t>
             </w:r>
@@ -1487,13 +1650,14 @@
         <w:tc>
           <w:tcPr>
             <w:tcW w:type="dxa" w:w="3360"/>
+            <w:vAlign w:val="center"/>
           </w:tcPr>
           <w:p>
             <w:r>
               <w:rPr>
-                <w:rFonts w:ascii="Calibri" w:hAnsi="Calibri"/>
+                <w:rFonts w:ascii="Arial" w:hAnsi="Arial"/>
                 <w:color w:val="1E1E1E"/>
-                <w:sz w:val="18"/>
+                <w:sz w:val="17"/>
               </w:rPr>
               <w:t>A valid genre may appear below Rank 1.</w:t>
             </w:r>
@@ -1502,13 +1666,14 @@
         <w:tc>
           <w:tcPr>
             <w:tcW w:type="dxa" w:w="3360"/>
+            <w:vAlign w:val="center"/>
           </w:tcPr>
           <w:p>
             <w:r>
               <w:rPr>
-                <w:rFonts w:ascii="Calibri" w:hAnsi="Calibri"/>
+                <w:rFonts w:ascii="Arial" w:hAnsi="Arial"/>
                 <w:color w:val="1E1E1E"/>
-                <w:sz w:val="18"/>
+                <w:sz w:val="17"/>
               </w:rPr>
               <w:t>Report Top-1, Top-3, and Top-5 results rather than one final label.</w:t>
             </w:r>
@@ -1584,6 +1749,7 @@
       <w:tblPr>
         <w:tblStyle w:val="TableGrid"/>
         <w:tblW w:type="auto" w:w="0"/>
+        <w:jc w:val="center"/>
         <w:tblLook w:firstColumn="1" w:firstRow="1" w:lastColumn="0" w:lastRow="0" w:noHBand="0" w:noVBand="1" w:val="04A0"/>
       </w:tblPr>
       <w:tblGrid>
@@ -1595,7 +1761,8 @@
         <w:tc>
           <w:tcPr>
             <w:tcW w:type="dxa" w:w="3360"/>
-            <w:shd w:fill="1F4D78"/>
+            <w:shd w:fill="0B3D3A"/>
+            <w:vAlign w:val="center"/>
           </w:tcPr>
           <w:p>
             <w:pPr>
@@ -1603,10 +1770,10 @@
             </w:pPr>
             <w:r>
               <w:rPr>
-                <w:rFonts w:ascii="Calibri" w:hAnsi="Calibri"/>
+                <w:rFonts w:ascii="Arial" w:hAnsi="Arial"/>
                 <w:b/>
                 <w:color w:val="FFFFFF"/>
-                <w:sz w:val="18"/>
+                <w:sz w:val="17"/>
               </w:rPr>
               <w:t>Item</w:t>
             </w:r>
@@ -1615,7 +1782,8 @@
         <w:tc>
           <w:tcPr>
             <w:tcW w:type="dxa" w:w="3360"/>
-            <w:shd w:fill="1F4D78"/>
+            <w:shd w:fill="0B3D3A"/>
+            <w:vAlign w:val="center"/>
           </w:tcPr>
           <w:p>
             <w:pPr>
@@ -1623,10 +1791,10 @@
             </w:pPr>
             <w:r>
               <w:rPr>
-                <w:rFonts w:ascii="Calibri" w:hAnsi="Calibri"/>
+                <w:rFonts w:ascii="Arial" w:hAnsi="Arial"/>
                 <w:b/>
                 <w:color w:val="FFFFFF"/>
-                <w:sz w:val="18"/>
+                <w:sz w:val="17"/>
               </w:rPr>
               <w:t>Location</w:t>
             </w:r>
@@ -1635,7 +1803,8 @@
         <w:tc>
           <w:tcPr>
             <w:tcW w:type="dxa" w:w="3360"/>
-            <w:shd w:fill="1F4D78"/>
+            <w:shd w:fill="0B3D3A"/>
+            <w:vAlign w:val="center"/>
           </w:tcPr>
           <w:p>
             <w:pPr>
@@ -1643,10 +1812,10 @@
             </w:pPr>
             <w:r>
               <w:rPr>
-                <w:rFonts w:ascii="Calibri" w:hAnsi="Calibri"/>
+                <w:rFonts w:ascii="Arial" w:hAnsi="Arial"/>
                 <w:b/>
                 <w:color w:val="FFFFFF"/>
-                <w:sz w:val="18"/>
+                <w:sz w:val="17"/>
               </w:rPr>
               <w:t>Status</w:t>
             </w:r>
@@ -1657,13 +1826,14 @@
         <w:tc>
           <w:tcPr>
             <w:tcW w:type="dxa" w:w="3360"/>
+            <w:vAlign w:val="center"/>
           </w:tcPr>
           <w:p>
             <w:r>
               <w:rPr>
-                <w:rFonts w:ascii="Calibri" w:hAnsi="Calibri"/>
+                <w:rFonts w:ascii="Arial" w:hAnsi="Arial"/>
                 <w:color w:val="1E1E1E"/>
-                <w:sz w:val="18"/>
+                <w:sz w:val="17"/>
               </w:rPr>
               <w:t>Final technical paper</w:t>
             </w:r>
@@ -1672,13 +1842,14 @@
         <w:tc>
           <w:tcPr>
             <w:tcW w:type="dxa" w:w="3360"/>
+            <w:vAlign w:val="center"/>
           </w:tcPr>
           <w:p>
             <w:r>
               <w:rPr>
-                <w:rFonts w:ascii="Calibri" w:hAnsi="Calibri"/>
+                <w:rFonts w:ascii="Arial" w:hAnsi="Arial"/>
                 <w:color w:val="1E1E1E"/>
-                <w:sz w:val="18"/>
+                <w:sz w:val="17"/>
               </w:rPr>
               <w:t>documentation/</w:t>
             </w:r>
@@ -1687,13 +1858,14 @@
         <w:tc>
           <w:tcPr>
             <w:tcW w:type="dxa" w:w="3360"/>
+            <w:vAlign w:val="center"/>
           </w:tcPr>
           <w:p>
             <w:r>
               <w:rPr>
-                <w:rFonts w:ascii="Calibri" w:hAnsi="Calibri"/>
+                <w:rFonts w:ascii="Arial" w:hAnsi="Arial"/>
                 <w:color w:val="1E1E1E"/>
-                <w:sz w:val="18"/>
+                <w:sz w:val="17"/>
               </w:rPr>
               <w:t>Ready</w:t>
             </w:r>
@@ -1704,13 +1876,14 @@
         <w:tc>
           <w:tcPr>
             <w:tcW w:type="dxa" w:w="3360"/>
+            <w:vAlign w:val="center"/>
           </w:tcPr>
           <w:p>
             <w:r>
               <w:rPr>
-                <w:rFonts w:ascii="Calibri" w:hAnsi="Calibri"/>
+                <w:rFonts w:ascii="Arial" w:hAnsi="Arial"/>
                 <w:color w:val="1E1E1E"/>
-                <w:sz w:val="18"/>
+                <w:sz w:val="17"/>
               </w:rPr>
               <w:t>Management report</w:t>
             </w:r>
@@ -1719,13 +1892,14 @@
         <w:tc>
           <w:tcPr>
             <w:tcW w:type="dxa" w:w="3360"/>
+            <w:vAlign w:val="center"/>
           </w:tcPr>
           <w:p>
             <w:r>
               <w:rPr>
-                <w:rFonts w:ascii="Calibri" w:hAnsi="Calibri"/>
+                <w:rFonts w:ascii="Arial" w:hAnsi="Arial"/>
                 <w:color w:val="1E1E1E"/>
-                <w:sz w:val="18"/>
+                <w:sz w:val="17"/>
               </w:rPr>
               <w:t>documentation/</w:t>
             </w:r>
@@ -1734,13 +1908,14 @@
         <w:tc>
           <w:tcPr>
             <w:tcW w:type="dxa" w:w="3360"/>
+            <w:vAlign w:val="center"/>
           </w:tcPr>
           <w:p>
             <w:r>
               <w:rPr>
-                <w:rFonts w:ascii="Calibri" w:hAnsi="Calibri"/>
+                <w:rFonts w:ascii="Arial" w:hAnsi="Arial"/>
                 <w:color w:val="1E1E1E"/>
-                <w:sz w:val="18"/>
+                <w:sz w:val="17"/>
               </w:rPr>
               <w:t>Ready</w:t>
             </w:r>
@@ -1751,13 +1926,14 @@
         <w:tc>
           <w:tcPr>
             <w:tcW w:type="dxa" w:w="3360"/>
+            <w:vAlign w:val="center"/>
           </w:tcPr>
           <w:p>
             <w:r>
               <w:rPr>
-                <w:rFonts w:ascii="Calibri" w:hAnsi="Calibri"/>
+                <w:rFonts w:ascii="Arial" w:hAnsi="Arial"/>
                 <w:color w:val="1E1E1E"/>
-                <w:sz w:val="18"/>
+                <w:sz w:val="17"/>
               </w:rPr>
               <w:t>Graded proposal</w:t>
             </w:r>
@@ -1766,13 +1942,14 @@
         <w:tc>
           <w:tcPr>
             <w:tcW w:type="dxa" w:w="3360"/>
+            <w:vAlign w:val="center"/>
           </w:tcPr>
           <w:p>
             <w:r>
               <w:rPr>
-                <w:rFonts w:ascii="Calibri" w:hAnsi="Calibri"/>
+                <w:rFonts w:ascii="Arial" w:hAnsi="Arial"/>
                 <w:color w:val="1E1E1E"/>
-                <w:sz w:val="18"/>
+                <w:sz w:val="17"/>
               </w:rPr>
               <w:t>documentation/Capstone_Project_Proposal_Graded.pdf</w:t>
             </w:r>
@@ -1781,13 +1958,14 @@
         <w:tc>
           <w:tcPr>
             <w:tcW w:type="dxa" w:w="3360"/>
+            <w:vAlign w:val="center"/>
           </w:tcPr>
           <w:p>
             <w:r>
               <w:rPr>
-                <w:rFonts w:ascii="Calibri" w:hAnsi="Calibri"/>
+                <w:rFonts w:ascii="Arial" w:hAnsi="Arial"/>
                 <w:color w:val="1E1E1E"/>
-                <w:sz w:val="18"/>
+                <w:sz w:val="17"/>
               </w:rPr>
               <w:t>Ready</w:t>
             </w:r>
@@ -1798,13 +1976,14 @@
         <w:tc>
           <w:tcPr>
             <w:tcW w:type="dxa" w:w="3360"/>
+            <w:vAlign w:val="center"/>
           </w:tcPr>
           <w:p>
             <w:r>
               <w:rPr>
-                <w:rFonts w:ascii="Calibri" w:hAnsi="Calibri"/>
+                <w:rFonts w:ascii="Arial" w:hAnsi="Arial"/>
                 <w:color w:val="1E1E1E"/>
-                <w:sz w:val="18"/>
+                <w:sz w:val="17"/>
               </w:rPr>
               <w:t>Notebook PDFs</w:t>
             </w:r>
@@ -1813,13 +1992,14 @@
         <w:tc>
           <w:tcPr>
             <w:tcW w:type="dxa" w:w="3360"/>
+            <w:vAlign w:val="center"/>
           </w:tcPr>
           <w:p>
             <w:r>
               <w:rPr>
-                <w:rFonts w:ascii="Calibri" w:hAnsi="Calibri"/>
+                <w:rFonts w:ascii="Arial" w:hAnsi="Arial"/>
                 <w:color w:val="1E1E1E"/>
-                <w:sz w:val="18"/>
+                <w:sz w:val="17"/>
               </w:rPr>
               <w:t>software artefacts/notebook_pdfs/</w:t>
             </w:r>
@@ -1828,13 +2008,14 @@
         <w:tc>
           <w:tcPr>
             <w:tcW w:type="dxa" w:w="3360"/>
+            <w:vAlign w:val="center"/>
           </w:tcPr>
           <w:p>
             <w:r>
               <w:rPr>
-                <w:rFonts w:ascii="Calibri" w:hAnsi="Calibri"/>
+                <w:rFonts w:ascii="Arial" w:hAnsi="Arial"/>
                 <w:color w:val="1E1E1E"/>
-                <w:sz w:val="18"/>
+                <w:sz w:val="17"/>
               </w:rPr>
               <w:t>Ready</w:t>
             </w:r>
@@ -1845,13 +2026,14 @@
         <w:tc>
           <w:tcPr>
             <w:tcW w:type="dxa" w:w="3360"/>
+            <w:vAlign w:val="center"/>
           </w:tcPr>
           <w:p>
             <w:r>
               <w:rPr>
-                <w:rFonts w:ascii="Calibri" w:hAnsi="Calibri"/>
+                <w:rFonts w:ascii="Arial" w:hAnsi="Arial"/>
                 <w:color w:val="1E1E1E"/>
-                <w:sz w:val="18"/>
+                <w:sz w:val="17"/>
               </w:rPr>
               <w:t>Notebook PDF manifest</w:t>
             </w:r>
@@ -1860,13 +2042,14 @@
         <w:tc>
           <w:tcPr>
             <w:tcW w:type="dxa" w:w="3360"/>
+            <w:vAlign w:val="center"/>
           </w:tcPr>
           <w:p>
             <w:r>
               <w:rPr>
-                <w:rFonts w:ascii="Calibri" w:hAnsi="Calibri"/>
+                <w:rFonts w:ascii="Arial" w:hAnsi="Arial"/>
                 <w:color w:val="1E1E1E"/>
-                <w:sz w:val="18"/>
+                <w:sz w:val="17"/>
               </w:rPr>
               <w:t>software artefacts/notebook_pdf_manifest.csv</w:t>
             </w:r>
@@ -1875,13 +2058,14 @@
         <w:tc>
           <w:tcPr>
             <w:tcW w:type="dxa" w:w="3360"/>
+            <w:vAlign w:val="center"/>
           </w:tcPr>
           <w:p>
             <w:r>
               <w:rPr>
-                <w:rFonts w:ascii="Calibri" w:hAnsi="Calibri"/>
+                <w:rFonts w:ascii="Arial" w:hAnsi="Arial"/>
                 <w:color w:val="1E1E1E"/>
-                <w:sz w:val="18"/>
+                <w:sz w:val="17"/>
               </w:rPr>
               <w:t>Ready</w:t>
             </w:r>
@@ -1892,13 +2076,14 @@
         <w:tc>
           <w:tcPr>
             <w:tcW w:type="dxa" w:w="3360"/>
+            <w:vAlign w:val="center"/>
           </w:tcPr>
           <w:p>
             <w:r>
               <w:rPr>
-                <w:rFonts w:ascii="Calibri" w:hAnsi="Calibri"/>
+                <w:rFonts w:ascii="Arial" w:hAnsi="Arial"/>
                 <w:color w:val="1E1E1E"/>
-                <w:sz w:val="18"/>
+                <w:sz w:val="17"/>
               </w:rPr>
               <w:t>Final model files</w:t>
             </w:r>
@@ -1907,13 +2092,14 @@
         <w:tc>
           <w:tcPr>
             <w:tcW w:type="dxa" w:w="3360"/>
+            <w:vAlign w:val="center"/>
           </w:tcPr>
           <w:p>
             <w:r>
               <w:rPr>
-                <w:rFonts w:ascii="Calibri" w:hAnsi="Calibri"/>
+                <w:rFonts w:ascii="Arial" w:hAnsi="Arial"/>
                 <w:color w:val="1E1E1E"/>
-                <w:sz w:val="18"/>
+                <w:sz w:val="17"/>
               </w:rPr>
               <w:t>models/</w:t>
             </w:r>
@@ -1922,13 +2108,14 @@
         <w:tc>
           <w:tcPr>
             <w:tcW w:type="dxa" w:w="3360"/>
+            <w:vAlign w:val="center"/>
           </w:tcPr>
           <w:p>
             <w:r>
               <w:rPr>
-                <w:rFonts w:ascii="Calibri" w:hAnsi="Calibri"/>
+                <w:rFonts w:ascii="Arial" w:hAnsi="Arial"/>
                 <w:color w:val="1E1E1E"/>
-                <w:sz w:val="18"/>
+                <w:sz w:val="17"/>
               </w:rPr>
               <w:t>Ready</w:t>
             </w:r>
@@ -1939,13 +2126,14 @@
         <w:tc>
           <w:tcPr>
             <w:tcW w:type="dxa" w:w="3360"/>
+            <w:vAlign w:val="center"/>
           </w:tcPr>
           <w:p>
             <w:r>
               <w:rPr>
-                <w:rFonts w:ascii="Calibri" w:hAnsi="Calibri"/>
+                <w:rFonts w:ascii="Arial" w:hAnsi="Arial"/>
                 <w:color w:val="1E1E1E"/>
-                <w:sz w:val="18"/>
+                <w:sz w:val="17"/>
               </w:rPr>
               <w:t>Final outputs</w:t>
             </w:r>
@@ -1954,13 +2142,14 @@
         <w:tc>
           <w:tcPr>
             <w:tcW w:type="dxa" w:w="3360"/>
+            <w:vAlign w:val="center"/>
           </w:tcPr>
           <w:p>
             <w:r>
               <w:rPr>
-                <w:rFonts w:ascii="Calibri" w:hAnsi="Calibri"/>
+                <w:rFonts w:ascii="Arial" w:hAnsi="Arial"/>
                 <w:color w:val="1E1E1E"/>
-                <w:sz w:val="18"/>
+                <w:sz w:val="17"/>
               </w:rPr>
               <w:t>outputs/notebook49_* and outputs/notebook50_*</w:t>
             </w:r>
@@ -1969,13 +2158,14 @@
         <w:tc>
           <w:tcPr>
             <w:tcW w:type="dxa" w:w="3360"/>
+            <w:vAlign w:val="center"/>
           </w:tcPr>
           <w:p>
             <w:r>
               <w:rPr>
-                <w:rFonts w:ascii="Calibri" w:hAnsi="Calibri"/>
+                <w:rFonts w:ascii="Arial" w:hAnsi="Arial"/>
                 <w:color w:val="1E1E1E"/>
-                <w:sz w:val="18"/>
+                <w:sz w:val="17"/>
               </w:rPr>
               <w:t>Ready</w:t>
             </w:r>
@@ -1986,13 +2176,14 @@
         <w:tc>
           <w:tcPr>
             <w:tcW w:type="dxa" w:w="3360"/>
+            <w:vAlign w:val="center"/>
           </w:tcPr>
           <w:p>
             <w:r>
               <w:rPr>
-                <w:rFonts w:ascii="Calibri" w:hAnsi="Calibri"/>
+                <w:rFonts w:ascii="Arial" w:hAnsi="Arial"/>
                 <w:color w:val="1E1E1E"/>
-                <w:sz w:val="18"/>
+                <w:sz w:val="17"/>
               </w:rPr>
               <w:t>External manifest</w:t>
             </w:r>
@@ -2001,13 +2192,14 @@
         <w:tc>
           <w:tcPr>
             <w:tcW w:type="dxa" w:w="3360"/>
+            <w:vAlign w:val="center"/>
           </w:tcPr>
           <w:p>
             <w:r>
               <w:rPr>
-                <w:rFonts w:ascii="Calibri" w:hAnsi="Calibri"/>
+                <w:rFonts w:ascii="Arial" w:hAnsi="Arial"/>
                 <w:color w:val="1E1E1E"/>
-                <w:sz w:val="18"/>
+                <w:sz w:val="17"/>
               </w:rPr>
               <w:t>data/external_audio_batch/external_audio_manifest.xlsx</w:t>
             </w:r>
@@ -2016,13 +2208,14 @@
         <w:tc>
           <w:tcPr>
             <w:tcW w:type="dxa" w:w="3360"/>
+            <w:vAlign w:val="center"/>
           </w:tcPr>
           <w:p>
             <w:r>
               <w:rPr>
-                <w:rFonts w:ascii="Calibri" w:hAnsi="Calibri"/>
+                <w:rFonts w:ascii="Arial" w:hAnsi="Arial"/>
                 <w:color w:val="1E1E1E"/>
-                <w:sz w:val="18"/>
+                <w:sz w:val="17"/>
               </w:rPr>
               <w:t>Ready</w:t>
             </w:r>
@@ -2076,7 +2269,7 @@
       <w:headerReference w:type="default" r:id="rId9"/>
       <w:footerReference w:type="default" r:id="rId10"/>
       <w:pgSz w:w="12240" w:h="15840"/>
-      <w:pgMar w:top="1080" w:right="1080" w:bottom="1080" w:left="1080" w:header="720" w:footer="720" w:gutter="0"/>
+      <w:pgMar w:top="1080" w:right="1152" w:bottom="1080" w:left="1152" w:header="720" w:footer="720" w:gutter="0"/>
       <w:cols w:space="720"/>
       <w:docGrid w:linePitch="360"/>
     </w:sectPr>
@@ -2489,8 +2682,8 @@
       <w:spacing w:line="276" w:lineRule="auto" w:after="140"/>
     </w:pPr>
     <w:rPr>
-      <w:rFonts w:ascii="Calibri" w:hAnsi="Calibri"/>
-      <w:sz w:val="22"/>
+      <w:rFonts w:ascii="Arial" w:hAnsi="Arial"/>
+      <w:sz w:val="21"/>
     </w:rPr>
   </w:style>
   <w:style w:type="paragraph" w:styleId="Header">
@@ -2552,10 +2745,10 @@
       <w:outlineLvl w:val="0"/>
     </w:pPr>
     <w:rPr>
-      <w:rFonts w:asciiTheme="majorHAnsi" w:eastAsiaTheme="majorEastAsia" w:hAnsiTheme="majorHAnsi" w:cstheme="majorBidi" w:ascii="Calibri" w:hAnsi="Calibri"/>
+      <w:rFonts w:asciiTheme="majorHAnsi" w:eastAsiaTheme="majorEastAsia" w:hAnsiTheme="majorHAnsi" w:cstheme="majorBidi" w:ascii="Arial" w:hAnsi="Arial"/>
       <w:b/>
       <w:bCs/>
-      <w:color w:val="2E74B5"/>
+      <w:color w:val="0B3D3A"/>
       <w:sz w:val="32"/>
       <w:szCs w:val="28"/>
     </w:rPr>
@@ -2576,10 +2769,10 @@
       <w:outlineLvl w:val="1"/>
     </w:pPr>
     <w:rPr>
-      <w:rFonts w:asciiTheme="majorHAnsi" w:eastAsiaTheme="majorEastAsia" w:hAnsiTheme="majorHAnsi" w:cstheme="majorBidi" w:ascii="Calibri" w:hAnsi="Calibri"/>
+      <w:rFonts w:asciiTheme="majorHAnsi" w:eastAsiaTheme="majorEastAsia" w:hAnsiTheme="majorHAnsi" w:cstheme="majorBidi" w:ascii="Arial" w:hAnsi="Arial"/>
       <w:b/>
       <w:bCs/>
-      <w:color w:val="2E74B5"/>
+      <w:color w:val="0B3D3A"/>
       <w:sz w:val="26"/>
       <w:szCs w:val="26"/>
     </w:rPr>

</xml_diff>